<commit_message>
Whitepaper: add campaign cost model for SHA-256 and Argon2id (7.4, D.10)
New section 7.4 quantifies a 10M msg/day mid-size campaign under both
initial work profiles: SHA-256 at d=20 costs a GPU-equipped operator
cents per day (client-to-GPU asymmetry ~10^5) while still acting as a
x100-x1000 throughput brake on botnets and abused accounts; the
illustrative Argon2id profile (m=16MiB t=1 d=8) shrinks the asymmetry
to an estimated factor ~300 and turns the same user-visible wait into
real attacker cost, with verification-DoS and constrained-device
consequences called out.

New D.10 records the measured JavaScript/native/WebCrypto hash rates
behind the model, the budget-vs-difficulty calibration rule (a 1 s
budget fails d=18 about half the time at 0.2 MH/s), and marks all
GPU/ASIC/Argon2id figures as estimates pending the Phase 0 benchmarks.

Co-Authored-By: Claude Fable 5 <noreply@anthropic.com>
</commit_message>
<xml_diff>
--- a/docs/ESF_End_Spam_Forever_Technical_Whitepaper.docx
+++ b/docs/ESF_End_Spam_Forever_Technical_Whitepaper.docx
@@ -2887,6 +2887,577 @@
       <w:pPr>
         <w:pStyle w:val="Spacer"/>
       </w:pPr>
+    </w:p>
+    <w:p>
+      <w:pPr>
+        <w:pStyle w:val="Heading2"/>
+      </w:pPr>
+      <w:r>
+        <w:t xml:space="preserve">7.4 Worked example: cost of a mid-size campaign</w:t>
+      </w:r>
+    </w:p>
+    <w:p>
+      <w:pPr>
+        <w:pStyle w:val="BodyText"/>
+      </w:pPr>
+      <w:r>
+        <w:t xml:space="preserve">The following model quantifies the economic effect of both initial profiles on a mid-size bulk campaign of 10 million messages per day, one stamp per recipient. The single-threaded JavaScript rate is measured with the reference implementation (Appendix D.10); optimized-native, GPU and ASIC rates are literature and benchmark estimates that MUST be replaced by the Phase 0 benchmark campaign before any difficulty value is standardized.</w:t>
+      </w:r>
+    </w:p>
+    <w:p>
+      <w:pPr>
+        <w:pStyle w:val="BodyText"/>
+      </w:pPr>
+      <w:r>
+        <w:t xml:space="preserve">Approximate SHA-256 rates per actor: legitimate client in a JavaScript runtime ~0.2 MH/s per thread (measured), optimized native code with SHA extensions ~10 MH/s per core, one current high-end GPU ~20 GH/s, one commodity hashing ASIC ~100 TH/s.</w:t>
+      </w:r>
+    </w:p>
+    <w:tbl>
+      <w:tblPr>
+        <w:tblStyle w:val="TableGrid"/>
+        <w:tblW w:w="5000" w:type="pct"/>
+        <w:tblBorders>
+          <w:top w:val="single" w:sz="4" w:space="0" w:color="D0D4DA"/>
+          <w:left w:val="single" w:sz="4" w:space="0" w:color="D0D4DA"/>
+          <w:bottom w:val="single" w:sz="4" w:space="0" w:color="D0D4DA"/>
+          <w:right w:val="single" w:sz="4" w:space="0" w:color="D0D4DA"/>
+          <w:insideH w:val="single" w:sz="4" w:space="0" w:color="D0D4DA"/>
+          <w:insideV w:val="single" w:sz="4" w:space="0" w:color="D0D4DA"/>
+        </w:tblBorders>
+      </w:tblPr>
+      <w:tblGrid>
+        <w:gridCol w:w="3120"/>
+        <w:gridCol w:w="3120"/>
+        <w:gridCol w:w="3120"/>
+      </w:tblGrid>
+      <w:tr>
+        <w:tc>
+          <w:tcPr>
+            <w:tcW w:w="3120" w:type="dxa"/>
+            <w:shd w:val="clear" w:fill="F1F3F6"/>
+          </w:tcPr>
+          <w:p>
+            <w:pPr>
+              <w:pStyle w:val="TableText"/>
+            </w:pPr>
+            <w:r>
+              <w:rPr>
+                <w:b/>
+              </w:rPr>
+              <w:t xml:space="preserve">SHA-256, d=20 (2^20 ≈ 1.05M trials/recipient)</w:t>
+            </w:r>
+          </w:p>
+        </w:tc>
+        <w:tc>
+          <w:tcPr>
+            <w:tcW w:w="3120" w:type="dxa"/>
+            <w:shd w:val="clear" w:fill="F1F3F6"/>
+          </w:tcPr>
+          <w:p>
+            <w:pPr>
+              <w:pStyle w:val="TableText"/>
+            </w:pPr>
+            <w:r>
+              <w:rPr>
+                <w:b/>
+              </w:rPr>
+              <w:t xml:space="preserve">Sustained load for 10M msg/day</w:t>
+            </w:r>
+          </w:p>
+        </w:tc>
+        <w:tc>
+          <w:tcPr>
+            <w:tcW w:w="3120" w:type="dxa"/>
+            <w:shd w:val="clear" w:fill="F1F3F6"/>
+          </w:tcPr>
+          <w:p>
+            <w:pPr>
+              <w:pStyle w:val="TableText"/>
+            </w:pPr>
+            <w:r>
+              <w:rPr>
+                <w:b/>
+              </w:rPr>
+              <w:t xml:space="preserve">Estimated added cost per day</w:t>
+            </w:r>
+          </w:p>
+        </w:tc>
+      </w:tr>
+      <w:tr>
+        <w:tc>
+          <w:tcPr>
+            <w:tcW w:w="3120" w:type="dxa"/>
+          </w:tcPr>
+          <w:p>
+            <w:pPr>
+              <w:pStyle w:val="TableText"/>
+            </w:pPr>
+            <w:r>
+              <w:t xml:space="preserve">Rented cloud CPUs (native, SHA extensions)</w:t>
+            </w:r>
+          </w:p>
+        </w:tc>
+        <w:tc>
+          <w:tcPr>
+            <w:tcW w:w="3120" w:type="dxa"/>
+          </w:tcPr>
+          <w:p>
+            <w:pPr>
+              <w:pStyle w:val="TableText"/>
+            </w:pPr>
+            <w:r>
+              <w:t xml:space="preserve">~12 cores</w:t>
+            </w:r>
+          </w:p>
+        </w:tc>
+        <w:tc>
+          <w:tcPr>
+            <w:tcW w:w="3120" w:type="dxa"/>
+          </w:tcPr>
+          <w:p>
+            <w:pPr>
+              <w:pStyle w:val="TableText"/>
+            </w:pPr>
+            <w:r>
+              <w:t xml:space="preserve">~5-10 EUR</w:t>
+            </w:r>
+          </w:p>
+        </w:tc>
+      </w:tr>
+      <w:tr>
+        <w:tc>
+          <w:tcPr>
+            <w:tcW w:w="3120" w:type="dxa"/>
+          </w:tcPr>
+          <w:p>
+            <w:pPr>
+              <w:pStyle w:val="TableText"/>
+            </w:pPr>
+            <w:r>
+              <w:t xml:space="preserve">One high-end GPU</w:t>
+            </w:r>
+          </w:p>
+        </w:tc>
+        <w:tc>
+          <w:tcPr>
+            <w:tcW w:w="3120" w:type="dxa"/>
+          </w:tcPr>
+          <w:p>
+            <w:pPr>
+              <w:pStyle w:val="TableText"/>
+            </w:pPr>
+            <w:r>
+              <w:t xml:space="preserve">~9 minutes of GPU time (&amp;lt;1% utilization)</w:t>
+            </w:r>
+          </w:p>
+        </w:tc>
+        <w:tc>
+          <w:tcPr>
+            <w:tcW w:w="3120" w:type="dxa"/>
+          </w:tcPr>
+          <w:p>
+            <w:pPr>
+              <w:pStyle w:val="TableText"/>
+            </w:pPr>
+            <w:r>
+              <w:t xml:space="preserve">~0.02 EUR electricity</w:t>
+            </w:r>
+          </w:p>
+        </w:tc>
+      </w:tr>
+      <w:tr>
+        <w:tc>
+          <w:tcPr>
+            <w:tcW w:w="3120" w:type="dxa"/>
+          </w:tcPr>
+          <w:p>
+            <w:pPr>
+              <w:pStyle w:val="TableText"/>
+            </w:pPr>
+            <w:r>
+              <w:t xml:space="preserve">Hashing ASIC</w:t>
+            </w:r>
+          </w:p>
+        </w:tc>
+        <w:tc>
+          <w:tcPr>
+            <w:tcW w:w="3120" w:type="dxa"/>
+          </w:tcPr>
+          <w:p>
+            <w:pPr>
+              <w:pStyle w:val="TableText"/>
+            </w:pPr>
+            <w:r>
+              <w:t xml:space="preserve">~0.1 s of device time</w:t>
+            </w:r>
+          </w:p>
+        </w:tc>
+        <w:tc>
+          <w:tcPr>
+            <w:tcW w:w="3120" w:type="dxa"/>
+          </w:tcPr>
+          <w:p>
+            <w:pPr>
+              <w:pStyle w:val="TableText"/>
+            </w:pPr>
+            <w:r>
+              <w:t xml:space="preserve">negligible</w:t>
+            </w:r>
+          </w:p>
+        </w:tc>
+      </w:tr>
+      <w:tr>
+        <w:tc>
+          <w:tcPr>
+            <w:tcW w:w="3120" w:type="dxa"/>
+          </w:tcPr>
+          <w:p>
+            <w:pPr>
+              <w:pStyle w:val="TableText"/>
+            </w:pPr>
+            <w:r>
+              <w:t xml:space="preserve">Botnet sending natively</w:t>
+            </w:r>
+          </w:p>
+        </w:tc>
+        <w:tc>
+          <w:tcPr>
+            <w:tcW w:w="3120" w:type="dxa"/>
+          </w:tcPr>
+          <w:p>
+            <w:pPr>
+              <w:pStyle w:val="TableText"/>
+            </w:pPr>
+            <w:r>
+              <w:t xml:space="preserve">throughput drops to ~5 msg/s per bot</w:t>
+            </w:r>
+          </w:p>
+        </w:tc>
+        <w:tc>
+          <w:tcPr>
+            <w:tcW w:w="3120" w:type="dxa"/>
+          </w:tcPr>
+          <w:p>
+            <w:pPr>
+              <w:pStyle w:val="TableText"/>
+            </w:pPr>
+            <w:r>
+              <w:t xml:space="preserve">victim pays energy; campaign duration x100+</w:t>
+            </w:r>
+          </w:p>
+        </w:tc>
+      </w:tr>
+      <w:tr>
+        <w:tc>
+          <w:tcPr>
+            <w:tcW w:w="3120" w:type="dxa"/>
+          </w:tcPr>
+          <w:p>
+            <w:pPr>
+              <w:pStyle w:val="TableText"/>
+            </w:pPr>
+            <w:r>
+              <w:t xml:space="preserve">Stolen webmail accounts (JavaScript rate)</w:t>
+            </w:r>
+          </w:p>
+        </w:tc>
+        <w:tc>
+          <w:tcPr>
+            <w:tcW w:w="3120" w:type="dxa"/>
+          </w:tcPr>
+          <w:p>
+            <w:pPr>
+              <w:pStyle w:val="TableText"/>
+            </w:pPr>
+            <w:r>
+              <w:t xml:space="preserve">~1 msg per 5 s per bot</w:t>
+            </w:r>
+          </w:p>
+        </w:tc>
+        <w:tc>
+          <w:tcPr>
+            <w:tcW w:w="3120" w:type="dxa"/>
+          </w:tcPr>
+          <w:p>
+            <w:pPr>
+              <w:pStyle w:val="TableText"/>
+            </w:pPr>
+            <w:r>
+              <w:t xml:space="preserve">throughput reduced x1000</w:t>
+            </w:r>
+          </w:p>
+        </w:tc>
+      </w:tr>
+    </w:tbl>
+    <w:p>
+      <w:pPr>
+        <w:pStyle w:val="Spacer"/>
+      </w:pPr>
+    </w:p>
+    <w:p>
+      <w:pPr>
+        <w:pStyle w:val="BodyText"/>
+      </w:pPr>
+      <w:r>
+        <w:t xml:space="preserve">The same difficulty costs a legitimate JavaScript client roughly five seconds per recipient. The asymmetry between that client and a GPU is therefore about five orders of magnitude: a compute-bound SHA-256 difficulty high enough to burden a GPU-equipped operator (roughly 34-35 bits for a four-digit EUR daily cost at this volume) would require hours per message from legitimate clients. Compute-bound difficulty alone cannot close this gap; it remains valuable as a portable bootstrap profile and as a throughput brake on botnets and abused accounts.</w:t>
+      </w:r>
+    </w:p>
+    <w:p>
+      <w:pPr>
+        <w:pStyle w:val="BodyText"/>
+      </w:pPr>
+      <w:r>
+        <w:t xml:space="preserve">Argon2id changes the picture because every evaluation must fill the configured memory. With the illustrative profile m=16384 (16 MiB), t=1, lanes=1, d=8 (2^8 = 256 expected evaluations per recipient, each touching roughly 32 MB), estimated rates are ~15-25 evaluations/s in a browser/WASM client, ~30-50 per native CPU core, ~300-600 per multi-core server (memory bandwidth, not cores, is the bottleneck) and ~5,000-15,000 for one 24 GB high-end GPU whose advantage is bounded by memory bandwidth and data-dependent addressing. No commodity Argon2id ASIC exists; the theoretical specialized-hardware advantage is bounded by memory cost to an estimated factor of 2-10.</w:t>
+      </w:r>
+    </w:p>
+    <w:tbl>
+      <w:tblPr>
+        <w:tblStyle w:val="TableGrid"/>
+        <w:tblW w:w="5000" w:type="pct"/>
+        <w:tblBorders>
+          <w:top w:val="single" w:sz="4" w:space="0" w:color="D0D4DA"/>
+          <w:left w:val="single" w:sz="4" w:space="0" w:color="D0D4DA"/>
+          <w:bottom w:val="single" w:sz="4" w:space="0" w:color="D0D4DA"/>
+          <w:right w:val="single" w:sz="4" w:space="0" w:color="D0D4DA"/>
+          <w:insideH w:val="single" w:sz="4" w:space="0" w:color="D0D4DA"/>
+          <w:insideV w:val="single" w:sz="4" w:space="0" w:color="D0D4DA"/>
+        </w:tblBorders>
+      </w:tblPr>
+      <w:tblGrid>
+        <w:gridCol w:w="3120"/>
+        <w:gridCol w:w="3120"/>
+        <w:gridCol w:w="3120"/>
+      </w:tblGrid>
+      <w:tr>
+        <w:tc>
+          <w:tcPr>
+            <w:tcW w:w="3120" w:type="dxa"/>
+            <w:shd w:val="clear" w:fill="F1F3F6"/>
+          </w:tcPr>
+          <w:p>
+            <w:pPr>
+              <w:pStyle w:val="TableText"/>
+            </w:pPr>
+            <w:r>
+              <w:rPr>
+                <w:b/>
+              </w:rPr>
+              <w:t xml:space="preserve">Argon2id m=16 MiB t=1 d=8, 10M msg/day (~30,000 evals/s sustained)</w:t>
+            </w:r>
+          </w:p>
+        </w:tc>
+        <w:tc>
+          <w:tcPr>
+            <w:tcW w:w="3120" w:type="dxa"/>
+            <w:shd w:val="clear" w:fill="F1F3F6"/>
+          </w:tcPr>
+          <w:p>
+            <w:pPr>
+              <w:pStyle w:val="TableText"/>
+            </w:pPr>
+            <w:r>
+              <w:rPr>
+                <w:b/>
+              </w:rPr>
+              <w:t xml:space="preserve">Sustained load</w:t>
+            </w:r>
+          </w:p>
+        </w:tc>
+        <w:tc>
+          <w:tcPr>
+            <w:tcW w:w="3120" w:type="dxa"/>
+            <w:shd w:val="clear" w:fill="F1F3F6"/>
+          </w:tcPr>
+          <w:p>
+            <w:pPr>
+              <w:pStyle w:val="TableText"/>
+            </w:pPr>
+            <w:r>
+              <w:rPr>
+                <w:b/>
+              </w:rPr>
+              <w:t xml:space="preserve">Estimated added cost per day</w:t>
+            </w:r>
+          </w:p>
+        </w:tc>
+      </w:tr>
+      <w:tr>
+        <w:tc>
+          <w:tcPr>
+            <w:tcW w:w="3120" w:type="dxa"/>
+          </w:tcPr>
+          <w:p>
+            <w:pPr>
+              <w:pStyle w:val="TableText"/>
+            </w:pPr>
+            <w:r>
+              <w:t xml:space="preserve">Rented cloud CPUs</w:t>
+            </w:r>
+          </w:p>
+        </w:tc>
+        <w:tc>
+          <w:tcPr>
+            <w:tcW w:w="3120" w:type="dxa"/>
+          </w:tcPr>
+          <w:p>
+            <w:pPr>
+              <w:pStyle w:val="TableText"/>
+            </w:pPr>
+            <w:r>
+              <w:t xml:space="preserve">~50-100 servers (bandwidth-bound)</w:t>
+            </w:r>
+          </w:p>
+        </w:tc>
+        <w:tc>
+          <w:tcPr>
+            <w:tcW w:w="3120" w:type="dxa"/>
+          </w:tcPr>
+          <w:p>
+            <w:pPr>
+              <w:pStyle w:val="TableText"/>
+            </w:pPr>
+            <w:r>
+              <w:t xml:space="preserve">~500-1,500 EUR</w:t>
+            </w:r>
+          </w:p>
+        </w:tc>
+      </w:tr>
+      <w:tr>
+        <w:tc>
+          <w:tcPr>
+            <w:tcW w:w="3120" w:type="dxa"/>
+          </w:tcPr>
+          <w:p>
+            <w:pPr>
+              <w:pStyle w:val="TableText"/>
+            </w:pPr>
+            <w:r>
+              <w:t xml:space="preserve">High-end GPUs</w:t>
+            </w:r>
+          </w:p>
+        </w:tc>
+        <w:tc>
+          <w:tcPr>
+            <w:tcW w:w="3120" w:type="dxa"/>
+          </w:tcPr>
+          <w:p>
+            <w:pPr>
+              <w:pStyle w:val="TableText"/>
+            </w:pPr>
+            <w:r>
+              <w:t xml:space="preserve">~2-6 devices permanently</w:t>
+            </w:r>
+          </w:p>
+        </w:tc>
+        <w:tc>
+          <w:tcPr>
+            <w:tcW w:w="3120" w:type="dxa"/>
+          </w:tcPr>
+          <w:p>
+            <w:pPr>
+              <w:pStyle w:val="TableText"/>
+            </w:pPr>
+            <w:r>
+              <w:t xml:space="preserve">~20-60 EUR</w:t>
+            </w:r>
+          </w:p>
+        </w:tc>
+      </w:tr>
+      <w:tr>
+        <w:tc>
+          <w:tcPr>
+            <w:tcW w:w="3120" w:type="dxa"/>
+          </w:tcPr>
+          <w:p>
+            <w:pPr>
+              <w:pStyle w:val="TableText"/>
+            </w:pPr>
+            <w:r>
+              <w:t xml:space="preserve">Specialized hardware</w:t>
+            </w:r>
+          </w:p>
+        </w:tc>
+        <w:tc>
+          <w:tcPr>
+            <w:tcW w:w="3120" w:type="dxa"/>
+          </w:tcPr>
+          <w:p>
+            <w:pPr>
+              <w:pStyle w:val="TableText"/>
+            </w:pPr>
+            <w:r>
+              <w:t xml:space="preserve">not commercially available; bounded advantage</w:t>
+            </w:r>
+          </w:p>
+        </w:tc>
+        <w:tc>
+          <w:tcPr>
+            <w:tcW w:w="3120" w:type="dxa"/>
+          </w:tcPr>
+          <w:p>
+            <w:pPr>
+              <w:pStyle w:val="TableText"/>
+            </w:pPr>
+            <w:r>
+              <w:t xml:space="preserve">capital-intensive, limited gain</w:t>
+            </w:r>
+          </w:p>
+        </w:tc>
+      </w:tr>
+      <w:tr>
+        <w:tc>
+          <w:tcPr>
+            <w:tcW w:w="3120" w:type="dxa"/>
+          </w:tcPr>
+          <w:p>
+            <w:pPr>
+              <w:pStyle w:val="TableText"/>
+            </w:pPr>
+            <w:r>
+              <w:t xml:space="preserve">Botnet sending natively</w:t>
+            </w:r>
+          </w:p>
+        </w:tc>
+        <w:tc>
+          <w:tcPr>
+            <w:tcW w:w="3120" w:type="dxa"/>
+          </w:tcPr>
+          <w:p>
+            <w:pPr>
+              <w:pStyle w:val="TableText"/>
+            </w:pPr>
+            <w:r>
+              <w:t xml:space="preserve">~1 msg per 5-8 s per bot; 16 MiB peak RAM per attempt limits parallelism on weak hosts</w:t>
+            </w:r>
+          </w:p>
+        </w:tc>
+        <w:tc>
+          <w:tcPr>
+            <w:tcW w:w="3120" w:type="dxa"/>
+          </w:tcPr>
+          <w:p>
+            <w:pPr>
+              <w:pStyle w:val="TableText"/>
+            </w:pPr>
+            <w:r>
+              <w:t xml:space="preserve">campaign duration x1000</w:t>
+            </w:r>
+          </w:p>
+        </w:tc>
+      </w:tr>
+    </w:tbl>
+    <w:p>
+      <w:pPr>
+        <w:pStyle w:val="Spacer"/>
+      </w:pPr>
+    </w:p>
+    <w:p>
+      <w:pPr>
+        <w:pStyle w:val="BodyText"/>
+      </w:pPr>
+      <w:r>
+        <w:t xml:space="preserve">The user-visible cost of this Argon2id profile (~10-15 s per recipient in a WASM client) is comparable to SHA-256 at d=20-22, but the client-to-GPU asymmetry shrinks from ~10^5 to an estimated factor of ~300. Parameters scale the effect linearly: quadrupling memory quadruples attacker cost without forcing a quadrupled user wait, because the receiver policy can lower d in exchange. Two costs must be engineered deliberately: verification of one Argon2id stamp costs the receiver tens of milliseconds and the configured memory rather than microseconds, which makes the bounds of section 6.7 and a memory cap mandatory before any Argon2id verification is attempted (section 16); and constrained devices need the delegation and limit mechanisms of section 13.</w:t>
+      </w:r>
     </w:p>
     <w:p>
       <w:pPr>
@@ -6510,6 +7081,86 @@
       </w:pPr>
       <w:r>
         <w:t xml:space="preserve">same core and vectors rather than reimplementing the wire format.</w:t>
+      </w:r>
+    </w:p>
+    <w:p>
+      <w:pPr>
+        <w:pStyle w:val="Heading2"/>
+      </w:pPr>
+      <w:r>
+        <w:t xml:space="preserve">D.10 Measured hash rates behind the section 7.4 model</w:t>
+      </w:r>
+    </w:p>
+    <w:p>
+      <w:pPr>
+        <w:pStyle w:val="BodyText"/>
+      </w:pPr>
+      <w:r>
+        <w:t xml:space="preserve">Measured on one mid-range Windows 11 desktop (Node.js 22, single thread, August 2026) with the reference core's own</w:t>
+      </w:r>
+    </w:p>
+    <w:p>
+      <w:pPr>
+        <w:pStyle w:val="BodyText"/>
+      </w:pPr>
+      <w:r>
+        <w:t xml:space="preserve">canonical work input: the bundled pure-JavaScript SHA-256 reaches ~198,000 H/s and per-call native hashing through the</w:t>
+      </w:r>
+    </w:p>
+    <w:p>
+      <w:pPr>
+        <w:pStyle w:val="BodyText"/>
+      </w:pPr>
+      <w:r>
+        <w:t xml:space="preserve">platform crypto API ~280,000 H/s, while WebCrypto's per-call async digest collapses to ~13,000 H/s - which is why the</w:t>
+      </w:r>
+    </w:p>
+    <w:p>
+      <w:pPr>
+        <w:pStyle w:val="BodyText"/>
+      </w:pPr>
+      <w:r>
+        <w:t xml:space="preserve">nonce search uses the synchronous implementation and reserves WebCrypto for one-shot token derivation. Practical</w:t>
+      </w:r>
+    </w:p>
+    <w:p>
+      <w:pPr>
+        <w:pStyle w:val="BodyText"/>
+      </w:pPr>
+      <w:r>
+        <w:t xml:space="preserve">consequence for defaults: at ~0.2 MH/s per thread, d=18 costs ~1.3 s and d=20 ~5 s per recipient; a one-second</w:t>
+      </w:r>
+    </w:p>
+    <w:p>
+      <w:pPr>
+        <w:pStyle w:val="BodyText"/>
+      </w:pPr>
+      <w:r>
+        <w:t xml:space="preserve">per-recipient budget therefore fails d=18 about half the time (the success probability within budget t is</w:t>
+      </w:r>
+    </w:p>
+    <w:p>
+      <w:pPr>
+        <w:pStyle w:val="BodyText"/>
+      </w:pPr>
+      <w:r>
+        <w:t xml:space="preserve">1 - e^(-t * rate / 2^d)), so compute budgets and baseline difficulty MUST be calibrated together. The GPU, ASIC and</w:t>
+      </w:r>
+    </w:p>
+    <w:p>
+      <w:pPr>
+        <w:pStyle w:val="BodyText"/>
+      </w:pPr>
+      <w:r>
+        <w:t xml:space="preserve">Argon2id numbers in section 7.4 are estimates from public benchmarks, not measurements; producing measured values</w:t>
+      </w:r>
+    </w:p>
+    <w:p>
+      <w:pPr>
+        <w:pStyle w:val="BodyText"/>
+      </w:pPr>
+      <w:r>
+        <w:t xml:space="preserve">across desktop, mobile, server and GPU hardware is the Phase 0 deliverable of section 14.</w:t>
       </w:r>
     </w:p>
     <w:p>

</xml_diff>